<commit_message>
docs(data): make data/README.md the verified entry point; update data docs
- data/README.md rewritten: every data file (working set vs raw) with rows, columns, source/license,
  synthetic flags and which code uses it; how the catalog derives from raw data (verified); known limits.
- Corrected: weather per-date files 38/16 (was 39/17), Chicago flight density, NYC lodging (Jersey City),
  availability file is split in the repo, catalog is used by A/B/C tools (not the old POC app).
- data/docs README_HE.md/.txt, DATA_DESCRIPTION_HE.txt and the .docx updated to the repo layout
  (paths, split file, current code, places/weather); airbnb README notes the split.
- README data section points to data/README.md and marks synthetic fields.
</commit_message>
<xml_diff>
--- a/data/docs/tourism_data_documentation_HE.docx
+++ b/data/docs/tourism_data_documentation_HE.docx
@@ -45,7 +45,7 @@
           <w:rtl w:val="1"/>
           <w:rFonts w:ascii="Arial" w:hAnsi="Arial" w:cs="Arial"/>
         </w:rPr>
-        <w:t>עודכן ונבדק ב־</w:t>
+        <w:t>עודכן ונבדק ב־21 באוקטובר 2026; הותאם למבנה מאגר GitHub ב־22 באוקטובר 2026. נקודת הכניסה העדכנית לכל קובצי הנתונים: data/README.md.</w:t>
       </w:r>
       <w:r>
         <w:rPr>
@@ -55,7 +55,6 @@
           <w:rtl w:val="1"/>
           <w:rFonts w:ascii="Arial" w:hAnsi="Arial" w:cs="Arial"/>
         </w:rPr>
-        <w:t>21</w:t>
       </w:r>
       <w:r>
         <w:rPr>
@@ -65,7 +64,6 @@
           <w:rtl w:val="1"/>
           <w:rFonts w:ascii="Arial" w:hAnsi="Arial" w:cs="Arial"/>
         </w:rPr>
-        <w:t xml:space="preserve"> באוקטובר </w:t>
       </w:r>
       <w:r>
         <w:rPr>
@@ -75,7 +73,6 @@
           <w:rtl w:val="1"/>
           <w:rFonts w:ascii="Arial" w:hAnsi="Arial" w:cs="Arial"/>
         </w:rPr>
-        <w:t>2026</w:t>
       </w:r>
     </w:p>
     <w:p>
@@ -970,7 +967,7 @@
           <w:rtl w:val="1"/>
           <w:rFonts w:ascii="Arial" w:hAnsi="Arial" w:cs="Arial"/>
         </w:rPr>
-        <w:t xml:space="preserve">כל הקבצים הבאים נמצאים תחת תיקיית </w:t>
+        <w:t>במאגר GitHub כל הקבצים הבאים נמצאים בתיקיית data; במקור הם הגיעו בתוך חבילת tourism_project_data_package.zip. סיומת csv.gz מציינת קובץ CSV דחוס ב־GZIP, שאפשר לקרוא ישירות באמצעות pandas או לחלץ לפני קריאה.</w:t>
       </w:r>
       <w:r>
         <w:rPr>
@@ -978,15 +975,13 @@
           <w:rtl w:val="0"/>
           <w:rFonts w:ascii="Arial" w:hAnsi="Arial" w:cs="Arial"/>
         </w:rPr>
-        <w:t>data</w:t>
-      </w:r>
-      <w:r>
-        <w:rPr>
-          <w:b w:val="0"/>
-          <w:rtl w:val="1"/>
-          <w:rFonts w:ascii="Arial" w:hAnsi="Arial" w:cs="Arial"/>
-        </w:rPr>
-        <w:t xml:space="preserve"> בתוך חבילת </w:t>
+      </w:r>
+      <w:r>
+        <w:rPr>
+          <w:b w:val="0"/>
+          <w:rtl w:val="1"/>
+          <w:rFonts w:ascii="Arial" w:hAnsi="Arial" w:cs="Arial"/>
+        </w:rPr>
       </w:r>
       <w:r>
         <w:rPr>
@@ -994,15 +989,13 @@
           <w:rtl w:val="0"/>
           <w:rFonts w:ascii="Arial" w:hAnsi="Arial" w:cs="Arial"/>
         </w:rPr>
-        <w:t>tourism_project_data_package.zip.</w:t>
-      </w:r>
-      <w:r>
-        <w:rPr>
-          <w:b w:val="0"/>
-          <w:rtl w:val="1"/>
-          <w:rFonts w:ascii="Arial" w:hAnsi="Arial" w:cs="Arial"/>
-        </w:rPr>
-        <w:t xml:space="preserve"> סיומת </w:t>
+      </w:r>
+      <w:r>
+        <w:rPr>
+          <w:b w:val="0"/>
+          <w:rtl w:val="1"/>
+          <w:rFonts w:ascii="Arial" w:hAnsi="Arial" w:cs="Arial"/>
+        </w:rPr>
       </w:r>
       <w:r>
         <w:rPr>
@@ -1010,15 +1003,13 @@
           <w:rtl w:val="0"/>
           <w:rFonts w:ascii="Arial" w:hAnsi="Arial" w:cs="Arial"/>
         </w:rPr>
-        <w:t>csv.gz</w:t>
-      </w:r>
-      <w:r>
-        <w:rPr>
-          <w:b w:val="0"/>
-          <w:rtl w:val="1"/>
-          <w:rFonts w:ascii="Arial" w:hAnsi="Arial" w:cs="Arial"/>
-        </w:rPr>
-        <w:t xml:space="preserve"> מציינת קובץ </w:t>
+      </w:r>
+      <w:r>
+        <w:rPr>
+          <w:b w:val="0"/>
+          <w:rtl w:val="1"/>
+          <w:rFonts w:ascii="Arial" w:hAnsi="Arial" w:cs="Arial"/>
+        </w:rPr>
       </w:r>
       <w:r>
         <w:rPr>
@@ -1026,15 +1017,13 @@
           <w:rtl w:val="0"/>
           <w:rFonts w:ascii="Arial" w:hAnsi="Arial" w:cs="Arial"/>
         </w:rPr>
-        <w:t>CSV</w:t>
-      </w:r>
-      <w:r>
-        <w:rPr>
-          <w:b w:val="0"/>
-          <w:rtl w:val="1"/>
-          <w:rFonts w:ascii="Arial" w:hAnsi="Arial" w:cs="Arial"/>
-        </w:rPr>
-        <w:t xml:space="preserve"> דחוס ב־</w:t>
+      </w:r>
+      <w:r>
+        <w:rPr>
+          <w:b w:val="0"/>
+          <w:rtl w:val="1"/>
+          <w:rFonts w:ascii="Arial" w:hAnsi="Arial" w:cs="Arial"/>
+        </w:rPr>
       </w:r>
       <w:r>
         <w:rPr>
@@ -1042,15 +1031,13 @@
           <w:rtl w:val="0"/>
           <w:rFonts w:ascii="Arial" w:hAnsi="Arial" w:cs="Arial"/>
         </w:rPr>
-        <w:t>GZIP,</w:t>
-      </w:r>
-      <w:r>
-        <w:rPr>
-          <w:b w:val="0"/>
-          <w:rtl w:val="1"/>
-          <w:rFonts w:ascii="Arial" w:hAnsi="Arial" w:cs="Arial"/>
-        </w:rPr>
-        <w:t xml:space="preserve"> שאפשר לקרוא ישירות באמצעות </w:t>
+      </w:r>
+      <w:r>
+        <w:rPr>
+          <w:b w:val="0"/>
+          <w:rtl w:val="1"/>
+          <w:rFonts w:ascii="Arial" w:hAnsi="Arial" w:cs="Arial"/>
+        </w:rPr>
       </w:r>
       <w:r>
         <w:rPr>
@@ -1058,15 +1045,13 @@
           <w:rtl w:val="0"/>
           <w:rFonts w:ascii="Arial" w:hAnsi="Arial" w:cs="Arial"/>
         </w:rPr>
-        <w:t>pandas</w:t>
-      </w:r>
-      <w:r>
-        <w:rPr>
-          <w:b w:val="0"/>
-          <w:rtl w:val="1"/>
-          <w:rFonts w:ascii="Arial" w:hAnsi="Arial" w:cs="Arial"/>
-        </w:rPr>
-        <w:t xml:space="preserve"> או לחלץ לפני קריאה.</w:t>
+      </w:r>
+      <w:r>
+        <w:rPr>
+          <w:b w:val="0"/>
+          <w:rtl w:val="1"/>
+          <w:rFonts w:ascii="Arial" w:hAnsi="Arial" w:cs="Arial"/>
+        </w:rPr>
       </w:r>
     </w:p>
     <w:p>
@@ -1214,7 +1199,7 @@
           <w:sz w:val="19"/>
           <w:noProof/>
         </w:rPr>
-        <w:t>airbnb_flight_destination_markets_availability_2022_synthetic.csv.gz</w:t>
+        <w:t>airbnb_flight_destination_markets_availability_2022_synthetic.csv.gz (במאגר: ..._part1.csv.gz + ..._part2.csv.gz)</w:t>
       </w:r>
     </w:p>
     <w:p>
@@ -1494,7 +1479,7 @@
           <w:rtl w:val="1"/>
           <w:rFonts w:ascii="Arial" w:hAnsi="Arial" w:cs="Arial"/>
         </w:rPr>
-        <w:t>קטלוג מצומצם ומנורמל שנבנה מהקבצים לעיל ומשמש את פעולת החיפוש המחוברת.</w:t>
+        <w:t>קטלוג מצומצם ומנורמל שנבנה מהקבצים לעיל ומשמש את כלי החיפוש והמחיר של שלוש המערכות (src/travel_agent/data_access.py, tools.py).</w:t>
       </w:r>
     </w:p>
     <w:p>
@@ -1526,15 +1511,14 @@
           <w:rtl w:val="0"/>
           <w:rFonts w:ascii="Arial" w:hAnsi="Arial" w:cs="Arial"/>
         </w:rPr>
-        <w:t>README_HE.md</w:t>
-      </w:r>
-      <w:r>
-        <w:rPr>
-          <w:b w:val="0"/>
-          <w:rtl w:val="1"/>
-          <w:rFonts w:ascii="Arial" w:hAnsi="Arial" w:cs="Arial"/>
-        </w:rPr>
-        <w:t xml:space="preserve"> בשורש החבילה מסכם את התכולה. </w:t>
+        <w:t>data/docs/README_HE.md מסכם את חבילת המקור, ו־data/README.md הוא נקודת הכניסה לכל קובצי הנתונים במאגר. data/docs/airbnb_destination_dataset_README.md מתאר את מקור הלינה ואת ההתאמה לשנת 2022. סקריפט ההכנה prepare_full_airbnb_markets.py אינו כלול במאגר.</w:t>
+      </w:r>
+      <w:r>
+        <w:rPr>
+          <w:b w:val="0"/>
+          <w:rtl w:val="1"/>
+          <w:rFonts w:ascii="Arial" w:hAnsi="Arial" w:cs="Arial"/>
+        </w:rPr>
       </w:r>
       <w:r>
         <w:rPr>
@@ -1542,31 +1526,27 @@
           <w:rtl w:val="0"/>
           <w:rFonts w:ascii="Arial" w:hAnsi="Arial" w:cs="Arial"/>
         </w:rPr>
-        <w:t>docs/airbnb_destination_dataset_README.md</w:t>
-      </w:r>
-      <w:r>
-        <w:rPr>
-          <w:b w:val="0"/>
-          <w:rtl w:val="1"/>
-          <w:rFonts w:ascii="Arial" w:hAnsi="Arial" w:cs="Arial"/>
-        </w:rPr>
-        <w:t xml:space="preserve"> מתאר את מקור הלינה וההתאמה לשנת </w:t>
-      </w:r>
-      <w:r>
-        <w:rPr>
-          <w:b w:val="0"/>
-          <w:rtl w:val="1"/>
-          <w:rFonts w:ascii="Arial" w:hAnsi="Arial" w:cs="Arial"/>
-        </w:rPr>
-        <w:t>2022.</w:t>
-      </w:r>
-      <w:r>
-        <w:rPr>
-          <w:b w:val="0"/>
-          <w:rtl w:val="1"/>
-          <w:rFonts w:ascii="Arial" w:hAnsi="Arial" w:cs="Arial"/>
-        </w:rPr>
-        <w:t xml:space="preserve"> סקריפט ההכנה </w:t>
+      </w:r>
+      <w:r>
+        <w:rPr>
+          <w:b w:val="0"/>
+          <w:rtl w:val="1"/>
+          <w:rFonts w:ascii="Arial" w:hAnsi="Arial" w:cs="Arial"/>
+        </w:rPr>
+      </w:r>
+      <w:r>
+        <w:rPr>
+          <w:b w:val="0"/>
+          <w:rtl w:val="1"/>
+          <w:rFonts w:ascii="Arial" w:hAnsi="Arial" w:cs="Arial"/>
+        </w:rPr>
+      </w:r>
+      <w:r>
+        <w:rPr>
+          <w:b w:val="0"/>
+          <w:rtl w:val="1"/>
+          <w:rFonts w:ascii="Arial" w:hAnsi="Arial" w:cs="Arial"/>
+        </w:rPr>
       </w:r>
       <w:r>
         <w:rPr>
@@ -1574,15 +1554,13 @@
           <w:rtl w:val="0"/>
           <w:rFonts w:ascii="Arial" w:hAnsi="Arial" w:cs="Arial"/>
         </w:rPr>
-        <w:t>prepare_full_airbnb_markets.py</w:t>
-      </w:r>
-      <w:r>
-        <w:rPr>
-          <w:b w:val="0"/>
-          <w:rtl w:val="1"/>
-          <w:rFonts w:ascii="Arial" w:hAnsi="Arial" w:cs="Arial"/>
-        </w:rPr>
-        <w:t xml:space="preserve"> שמור בנפרד בקובצי הפרויקט ואינו כלול בתוך ה־</w:t>
+      </w:r>
+      <w:r>
+        <w:rPr>
+          <w:b w:val="0"/>
+          <w:rtl w:val="1"/>
+          <w:rFonts w:ascii="Arial" w:hAnsi="Arial" w:cs="Arial"/>
+        </w:rPr>
       </w:r>
       <w:r>
         <w:rPr>
@@ -1590,15 +1568,13 @@
           <w:rtl w:val="0"/>
           <w:rFonts w:ascii="Arial" w:hAnsi="Arial" w:cs="Arial"/>
         </w:rPr>
-        <w:t>ZIP</w:t>
-      </w:r>
-      <w:r>
-        <w:rPr>
-          <w:b w:val="0"/>
-          <w:rtl w:val="1"/>
-          <w:rFonts w:ascii="Arial" w:hAnsi="Arial" w:cs="Arial"/>
-        </w:rPr>
-        <w:t xml:space="preserve"> הזה.</w:t>
+      </w:r>
+      <w:r>
+        <w:rPr>
+          <w:b w:val="0"/>
+          <w:rtl w:val="1"/>
+          <w:rFonts w:ascii="Arial" w:hAnsi="Arial" w:cs="Arial"/>
+        </w:rPr>
       </w:r>
     </w:p>
     <w:p>
@@ -3950,7 +3926,7 @@
           <w:sz w:val="19"/>
           <w:noProof/>
         </w:rPr>
-        <w:t>airbnb_flight_destination_markets_availability_2022_synthetic.csv.gz</w:t>
+        <w:t>airbnb_flight_destination_markets_availability_2022_synthetic.csv.gz (במאגר: ..._part1.csv.gz + ..._part2.csv.gz)</w:t>
       </w:r>
     </w:p>
     <w:p>
@@ -11709,7 +11685,7 @@
           <w:rtl w:val="1"/>
           <w:rFonts w:ascii="Arial" w:hAnsi="Arial" w:cs="Arial"/>
         </w:rPr>
-        <w:t>בקשות חיפוש, מועמדויות לחבילות, פירוט מחירים ועקבות פעולות נוצרות על ידי הקוד על בסיס הקטלוג. במימוש המקומי הן נשמרות ב־</w:t>
+        <w:t>בקשות חיפוש, מועמדויות לחבילות, פירוט מחירים ועקבות פעולות נוצרים על ידי הקוד על בסיס הקטלוג. במימוש הנוכחי ההשוואות, סטטוסי הריצה, התוצאות ואירועי המדידה נשמרים ב־SQLite בתיקייה runtime/ (src/travel_agent/comparison.py), ותוצאות ההערכה הגולמיות נשמרות ב־eval/results. שתי התיקיות אינן נשמרות במאגר. אלו תוצרי הרצה ולא נתוני מקור מהספקים.</w:t>
       </w:r>
       <w:r>
         <w:rPr>
@@ -11717,15 +11693,13 @@
           <w:rtl w:val="0"/>
           <w:rFonts w:ascii="Arial" w:hAnsi="Arial" w:cs="Arial"/>
         </w:rPr>
-        <w:t>SQLite;</w:t>
-      </w:r>
-      <w:r>
-        <w:rPr>
-          <w:b w:val="0"/>
-          <w:rtl w:val="1"/>
-          <w:rFonts w:ascii="Arial" w:hAnsi="Arial" w:cs="Arial"/>
-        </w:rPr>
-        <w:t xml:space="preserve"> באתר המתארח הן נשמרות כקובצי </w:t>
+      </w:r>
+      <w:r>
+        <w:rPr>
+          <w:b w:val="0"/>
+          <w:rtl w:val="1"/>
+          <w:rFonts w:ascii="Arial" w:hAnsi="Arial" w:cs="Arial"/>
+        </w:rPr>
       </w:r>
       <w:r>
         <w:rPr>
@@ -11733,15 +11707,13 @@
           <w:rtl w:val="0"/>
           <w:rFonts w:ascii="Arial" w:hAnsi="Arial" w:cs="Arial"/>
         </w:rPr>
-        <w:t>JSON</w:t>
-      </w:r>
-      <w:r>
-        <w:rPr>
-          <w:b w:val="0"/>
-          <w:rtl w:val="1"/>
-          <w:rFonts w:ascii="Arial" w:hAnsi="Arial" w:cs="Arial"/>
-        </w:rPr>
-        <w:t xml:space="preserve"> באחסון הפרטי של השרת. אלו תוצרי הרצה ולא נתוני מקור מהספקים.</w:t>
+      </w:r>
+      <w:r>
+        <w:rPr>
+          <w:b w:val="0"/>
+          <w:rtl w:val="1"/>
+          <w:rFonts w:ascii="Arial" w:hAnsi="Arial" w:cs="Arial"/>
+        </w:rPr>
       </w:r>
     </w:p>
     <w:p>
@@ -11755,7 +11727,7 @@
           <w:rtl w:val="1"/>
           <w:rFonts w:ascii="Arial" w:hAnsi="Arial" w:cs="Arial"/>
         </w:rPr>
-        <w:t>הסכמות, החלטות משא ומתן, אישורי הזמנה מדומים ותוכן המסלול בתרחיש הממשק הם נתוני הדגמה נפרדים. בחבילת הדאטא אין מאגר מאומת של אטרקציות או מופעים. פעולת החיפוש המחוברת אינה מפעילה מודל שפה ואינה מבצעת הזמנה אמיתית.</w:t>
+        <w:t>חבילת המקור אינה כוללת מאגר אטרקציות או מופעים. במאגר נוספו נתוני מקומות מ־OpenStreetMap ו־Wikivoyage (data/places) ונתוני מזג אוויר מ־Open-Meteo (data/weather). המקומות אינם מאומתים לשנת 2022, ושדות הדירוג, מספר הביקורות, משך הביקור ורוב רמות המחיר בהם סינתטיים. כלי החיפוש עצמם אינם מפעילים מודל שפה ואינם מבצעים הזמנה אמיתית; מערכות B ו־C משתמשות במודל שפה כדי לבחור ולשבץ מתוך תוצאות הכלים.</w:t>
       </w:r>
     </w:p>
     <w:p>
@@ -11897,39 +11869,35 @@
           <w:rtl w:val="1"/>
           <w:rFonts w:ascii="Arial" w:hAnsi="Arial" w:cs="Arial"/>
         </w:rPr>
-        <w:t>ב־</w:t>
-      </w:r>
-      <w:r>
-        <w:rPr>
-          <w:b w:val="0"/>
-          <w:rtl w:val="1"/>
-          <w:rFonts w:ascii="Arial" w:hAnsi="Arial" w:cs="Arial"/>
-        </w:rPr>
-        <w:t>21</w:t>
-      </w:r>
-      <w:r>
-        <w:rPr>
-          <w:b w:val="0"/>
-          <w:rtl w:val="1"/>
-          <w:rFonts w:ascii="Arial" w:hAnsi="Arial" w:cs="Arial"/>
-        </w:rPr>
-        <w:t xml:space="preserve"> באוקטובר </w:t>
-      </w:r>
-      <w:r>
-        <w:rPr>
-          <w:b w:val="0"/>
-          <w:rtl w:val="1"/>
-          <w:rFonts w:ascii="Arial" w:hAnsi="Arial" w:cs="Arial"/>
-        </w:rPr>
-        <w:t>2026</w:t>
-      </w:r>
-      <w:r>
-        <w:rPr>
-          <w:b w:val="0"/>
-          <w:rtl w:val="1"/>
-          <w:rFonts w:ascii="Arial" w:hAnsi="Arial" w:cs="Arial"/>
-        </w:rPr>
-        <w:t xml:space="preserve"> תוקנה אריזת ה־</w:t>
+        <w:t>ב־21 באוקטובר 2026 תוקנה אריזת ה־ZIP, לאחר שהתברר שהעותקים של שני קובצי Airbnb בתוכה נחתכו. הם הוחלפו בקבצים המלאים השמורים. בדיקת ה־ZIP עברה ונבדק שהקטלוג עצמו נשאר זהה. המסמך מתאר את החבילה לאחר תיקון זה. במאגר GitHub קובץ הזמינות פוצל לשני חלקים בגלל מגבלת 100MB; השחזור והשוואת ה־SHA מתוארים ב־data/README.md.</w:t>
+      </w:r>
+      <w:r>
+        <w:rPr>
+          <w:b w:val="0"/>
+          <w:rtl w:val="1"/>
+          <w:rFonts w:ascii="Arial" w:hAnsi="Arial" w:cs="Arial"/>
+        </w:rPr>
+      </w:r>
+      <w:r>
+        <w:rPr>
+          <w:b w:val="0"/>
+          <w:rtl w:val="1"/>
+          <w:rFonts w:ascii="Arial" w:hAnsi="Arial" w:cs="Arial"/>
+        </w:rPr>
+      </w:r>
+      <w:r>
+        <w:rPr>
+          <w:b w:val="0"/>
+          <w:rtl w:val="1"/>
+          <w:rFonts w:ascii="Arial" w:hAnsi="Arial" w:cs="Arial"/>
+        </w:rPr>
+      </w:r>
+      <w:r>
+        <w:rPr>
+          <w:b w:val="0"/>
+          <w:rtl w:val="1"/>
+          <w:rFonts w:ascii="Arial" w:hAnsi="Arial" w:cs="Arial"/>
+        </w:rPr>
       </w:r>
       <w:r>
         <w:rPr>
@@ -11937,15 +11905,13 @@
           <w:rtl w:val="0"/>
           <w:rFonts w:ascii="Arial" w:hAnsi="Arial" w:cs="Arial"/>
         </w:rPr>
-        <w:t>ZIP,</w:t>
-      </w:r>
-      <w:r>
-        <w:rPr>
-          <w:b w:val="0"/>
-          <w:rtl w:val="1"/>
-          <w:rFonts w:ascii="Arial" w:hAnsi="Arial" w:cs="Arial"/>
-        </w:rPr>
-        <w:t xml:space="preserve"> לאחר שהתברר שהעותקים של שני קובצי </w:t>
+      </w:r>
+      <w:r>
+        <w:rPr>
+          <w:b w:val="0"/>
+          <w:rtl w:val="1"/>
+          <w:rFonts w:ascii="Arial" w:hAnsi="Arial" w:cs="Arial"/>
+        </w:rPr>
       </w:r>
       <w:r>
         <w:rPr>
@@ -11953,15 +11919,13 @@
           <w:rtl w:val="0"/>
           <w:rFonts w:ascii="Arial" w:hAnsi="Arial" w:cs="Arial"/>
         </w:rPr>
-        <w:t>Airbnb</w:t>
-      </w:r>
-      <w:r>
-        <w:rPr>
-          <w:b w:val="0"/>
-          <w:rtl w:val="1"/>
-          <w:rFonts w:ascii="Arial" w:hAnsi="Arial" w:cs="Arial"/>
-        </w:rPr>
-        <w:t xml:space="preserve"> בתוכה נחתכו. הם הוחלפו בקבצים המלאים השמורים. בדיקת ה־</w:t>
+      </w:r>
+      <w:r>
+        <w:rPr>
+          <w:b w:val="0"/>
+          <w:rtl w:val="1"/>
+          <w:rFonts w:ascii="Arial" w:hAnsi="Arial" w:cs="Arial"/>
+        </w:rPr>
       </w:r>
       <w:r>
         <w:rPr>
@@ -11969,15 +11933,13 @@
           <w:rtl w:val="0"/>
           <w:rFonts w:ascii="Arial" w:hAnsi="Arial" w:cs="Arial"/>
         </w:rPr>
-        <w:t>ZIP</w:t>
-      </w:r>
-      <w:r>
-        <w:rPr>
-          <w:b w:val="0"/>
-          <w:rtl w:val="1"/>
-          <w:rFonts w:ascii="Arial" w:hAnsi="Arial" w:cs="Arial"/>
-        </w:rPr>
-        <w:t xml:space="preserve"> עברה ונבדק שהקטלוג עצמו נשאר זהה. המסמך מתאר את החבילה לאחר תיקון זה.</w:t>
+      </w:r>
+      <w:r>
+        <w:rPr>
+          <w:b w:val="0"/>
+          <w:rtl w:val="1"/>
+          <w:rFonts w:ascii="Arial" w:hAnsi="Arial" w:cs="Arial"/>
+        </w:rPr>
       </w:r>
     </w:p>
     <w:p>
@@ -12347,7 +12309,7 @@
           <w:sz w:val="19"/>
           <w:noProof/>
         </w:rPr>
-        <w:t>README_HE.md</w:t>
+        <w:t>data/docs/README_HE.md</w:t>
       </w:r>
     </w:p>
     <w:p>
@@ -12377,7 +12339,7 @@
           <w:sz w:val="19"/>
           <w:noProof/>
         </w:rPr>
-        <w:t>docs/airbnb_destination_dataset_README.md</w:t>
+        <w:t>data/docs/airbnb_destination_dataset_README.md</w:t>
       </w:r>
     </w:p>
     <w:p>
@@ -12461,7 +12423,7 @@
           <w:sz w:val="19"/>
           <w:noProof/>
         </w:rPr>
-        <w:t>prepare_full_airbnb_markets.py</w:t>
+        <w:t>prepare_full_airbnb_markets.py (לא כלול במאגר)</w:t>
       </w:r>
     </w:p>
     <w:p>
@@ -12491,7 +12453,7 @@
           <w:sz w:val="19"/>
           <w:noProof/>
         </w:rPr>
-        <w:t>backend/catalog.py, worker/hosted-catalogue.mjs</w:t>
+        <w:t>src/travel_agent/data_access.py, src/travel_agent/tools.py</w:t>
       </w:r>
     </w:p>
     <w:p>
@@ -12505,7 +12467,7 @@
           <w:rtl w:val="1"/>
           <w:rFonts w:ascii="Arial" w:hAnsi="Arial" w:cs="Arial"/>
         </w:rPr>
-        <w:t>כללי החיפוש והחישוב של הגרסה המקומית והאתר, בהתאמה; אלה קובצי קוד של האפליקציה.</w:t>
+        <w:t>קריאת הקטלוג וכללי החיפוש והחישוב של שלוש המערכות. בגרסת ה־POC הקודמת אלה היו backend/catalog.py ו־worker/hosted-catalogue.mjs, שאינם במאגר.</w:t>
       </w:r>
     </w:p>
     <w:p>

</xml_diff>